<commit_message>
kapitel 4.2 und 4.4 erster draft
</commit_message>
<xml_diff>
--- a/notes/Sicherheitsmaßnahmen_Prompt_Injection.docx
+++ b/notes/Sicherheitsmaßnahmen_Prompt_Injection.docx
@@ -154,16 +154,16 @@
         </w:numPr>
       </w:pPr>
       <w:r>
-        <w:t>Grenzen: Modellseitige Härtung reduziert die Erfolgsquote, ist aber nie vollständig — neue Umgehungsformulierungen (</w:t>
-      </w:r>
-      <w:proofErr w:type="spellStart"/>
-      <w:r>
-        <w:t>Obfuskation</w:t>
-      </w:r>
-      <w:proofErr w:type="spellEnd"/>
-      <w:r>
-        <w:t>, Sprachwechsel, Encoding) tauchen laufend auf. Daher nie alleinige Verteidigungslinie.</w:t>
-      </w:r>
+        <w:t xml:space="preserve">Nicht auf lokale Seiten </w:t>
+      </w:r>
+      <w:proofErr w:type="gramStart"/>
+      <w:r>
+        <w:t>zugreifen</w:t>
+      </w:r>
+      <w:r>
+        <w:t xml:space="preserve"> ?</w:t>
+      </w:r>
+      <w:proofErr w:type="gramEnd"/>
     </w:p>
     <w:p>
       <w:r>
@@ -195,7 +195,19 @@
       </w:r>
       <w:proofErr w:type="spellEnd"/>
       <w:r>
-        <w:t>-Signaturen, Begrenzung von Länge/Format, Entfernen oder Neutralisieren verdächtiger Steuerzeichen.</w:t>
+        <w:t xml:space="preserve">-Signaturen, </w:t>
+      </w:r>
+      <w:r>
+        <w:t>(</w:t>
+      </w:r>
+      <w:r>
+        <w:t>Begrenzung von Länge/Format</w:t>
+      </w:r>
+      <w:r>
+        <w:t>)</w:t>
+      </w:r>
+      <w:r>
+        <w:t>, Entfernen oder Neutralisieren verdächtiger Steuerzeichen.</w:t>
       </w:r>
     </w:p>
     <w:p>
@@ -291,7 +303,7 @@
       </w:r>
       <w:proofErr w:type="spellEnd"/>
       <w:r>
-        <w:t>) prüft Eingaben und Tool-Ergebnisse vor Weitergabe an das Hauptmodell — analog zu einer WAF im Webkontext.</w:t>
+        <w:t xml:space="preserve">) prüft Eingaben und Tool-Ergebnisse vor Weitergabe an das Hauptmodell </w:t>
       </w:r>
     </w:p>
     <w:p>
@@ -302,39 +314,6 @@
           <w:numId w:val="10"/>
         </w:numPr>
       </w:pPr>
-      <w:proofErr w:type="spellStart"/>
-      <w:r>
-        <w:t>Sanitisierung</w:t>
-      </w:r>
-      <w:proofErr w:type="spellEnd"/>
-      <w:r>
-        <w:t xml:space="preserve"> von RAG-/Retrieval-Inhalten: Dokumente, die per Retrieval-</w:t>
-      </w:r>
-      <w:proofErr w:type="spellStart"/>
-      <w:r>
-        <w:t>Augmented</w:t>
-      </w:r>
-      <w:proofErr w:type="spellEnd"/>
-      <w:r>
-        <w:t xml:space="preserve"> Generation eingebunden werden, gelten grundsätzlich als nicht vertrauenswürdig und werden vor Einbettung in den Prompt separat gescannt (häufig übersehener Angriffsvektor: "indirekte Prompt </w:t>
-      </w:r>
-      <w:proofErr w:type="spellStart"/>
-      <w:r>
-        <w:t>Injection</w:t>
-      </w:r>
-      <w:proofErr w:type="spellEnd"/>
-      <w:r>
-        <w:t>" über Webseiten, PDFs, E-Mails).</w:t>
-      </w:r>
-    </w:p>
-    <w:p>
-      <w:pPr>
-        <w:pStyle w:val="Listenabsatz"/>
-        <w:numPr>
-          <w:ilvl w:val="0"/>
-          <w:numId w:val="10"/>
-        </w:numPr>
-      </w:pPr>
       <w:r>
         <w:t>Encoding-Normalisierung: Erkennung von Verschleierungstechniken wie Base64, Unicode-Homoglyphen, Zero-Width-Zeichen, die genutzt werden, um Filter zu umgehen.</w:t>
       </w:r>
@@ -353,7 +332,6 @@
         </w:numPr>
       </w:pPr>
       <w:r>
-        <w:lastRenderedPageBreak/>
         <w:t>Trennung von System-, Entwickler-, Nutzer- und Tool-Input: Nutzung struktureller Rollen (</w:t>
       </w:r>
       <w:proofErr w:type="spellStart"/>
@@ -435,6 +413,7 @@
       </w:pPr>
       <w:proofErr w:type="spellStart"/>
       <w:r>
+        <w:lastRenderedPageBreak/>
         <w:t>Sandwiching</w:t>
       </w:r>
       <w:proofErr w:type="spellEnd"/>
@@ -577,7 +556,7 @@
         </w:numPr>
       </w:pPr>
       <w:r>
-        <w:t>Control-/Data-Plane-Separation: Klare technische Trennung zwischen dem Kanal, der Handlungsentscheidungen trifft (Control Plane), und dem Kanal, der externe/nutzergenerierte Daten transportiert (Data Plane) — analog zur Trennung von Code und Daten bei SQL-Injection-Abwehr.</w:t>
+        <w:t xml:space="preserve">Control-/Data-Plane-Separation: Klare technische Trennung zwischen dem Kanal, der Handlungsentscheidungen trifft (Control Plane), und dem Kanal, der externe/nutzergenerierte Daten transportiert (Data Plane) </w:t>
       </w:r>
     </w:p>
     <w:p>
@@ -655,7 +634,6 @@
     </w:p>
     <w:p>
       <w:r>
-        <w:lastRenderedPageBreak/>
         <w:t>5.5 Zugriffs- und Rechtekontrollen</w:t>
       </w:r>
     </w:p>
@@ -693,7 +671,11 @@
       </w:r>
       <w:proofErr w:type="spellEnd"/>
       <w:r>
-        <w:t>: API-Keys und Datenbankzugriffe werden pro Nutzer-/Sitzungskontext ausgestellt, sodass ein injizierter Prompt nie über die Rechte des anfragenden Nutzers hinausgehen kann (Vermeidung des "</w:t>
+        <w:t xml:space="preserve">: API-Keys und Datenbankzugriffe werden pro Nutzer-/Sitzungskontext ausgestellt, sodass ein injizierter Prompt nie über die Rechte </w:t>
+      </w:r>
+      <w:r>
+        <w:lastRenderedPageBreak/>
+        <w:t>des anfragenden Nutzers hinausgehen kann (Vermeidung des "</w:t>
       </w:r>
       <w:proofErr w:type="spellStart"/>
       <w:r>
@@ -843,15 +825,7 @@
         </w:numPr>
       </w:pPr>
       <w:r>
-        <w:t xml:space="preserve">Canary Tokens / </w:t>
-      </w:r>
-      <w:proofErr w:type="spellStart"/>
-      <w:r>
-        <w:t>Honeytokens</w:t>
-      </w:r>
-      <w:proofErr w:type="spellEnd"/>
-      <w:r>
-        <w:t>: Geheime Marker im System-Prompt; ihr Auftauchen in der Ausgabe signalisiert eine erfolgreiche Prompt-Extraktion.</w:t>
+        <w:t>Confidence-/Ensemble-Checks: Mehrere Modellaufrufe oder ein zweites "Kritiker"-Modell bewerten kritische Entscheidungen gegenseitig, bevor sie ausgeführt werden.</w:t>
       </w:r>
     </w:p>
     <w:p>
@@ -863,77 +837,21 @@
         </w:numPr>
       </w:pPr>
       <w:r>
-        <w:t>Confidence-/Ensemble-Checks: Mehrere Modellaufrufe oder ein zweites "Kritiker"-Modell bewerten kritische Entscheidungen gegenseitig, bevor sie ausgeführt werden.</w:t>
+        <w:t xml:space="preserve">Vollständiges </w:t>
+      </w:r>
+      <w:proofErr w:type="spellStart"/>
+      <w:r>
+        <w:t>Logging</w:t>
+      </w:r>
+      <w:proofErr w:type="spellEnd"/>
+      <w:r>
+        <w:t xml:space="preserve"> &amp; Auditing: Lückenlose Protokollierung von Prompts, Kontext, Tool-Calls und Ergebnissen für forensische Nachvollziehbarkeit und iterative Filterverbesserung.</w:t>
       </w:r>
     </w:p>
+    <w:p/>
     <w:p>
-      <w:pPr>
-        <w:pStyle w:val="Listenabsatz"/>
-        <w:numPr>
-          <w:ilvl w:val="0"/>
-          <w:numId w:val="13"/>
-        </w:numPr>
-      </w:pPr>
-      <w:r>
-        <w:t xml:space="preserve">Vollständiges </w:t>
-      </w:r>
-      <w:proofErr w:type="spellStart"/>
-      <w:r>
-        <w:t>Logging</w:t>
-      </w:r>
-      <w:proofErr w:type="spellEnd"/>
-      <w:r>
-        <w:t xml:space="preserve"> &amp; Auditing: Lückenlose Protokollierung von Prompts, Kontext, Tool-Calls und Ergebnissen für forensische Nachvollziehbarkeit und iterative Filterverbesserung.</w:t>
-      </w:r>
-    </w:p>
-    <w:p>
-      <w:r>
-        <w:t>5.7 Organisatorische und prozessuale Maßnahmen</w:t>
-      </w:r>
-    </w:p>
-    <w:p>
-      <w:pPr>
-        <w:pStyle w:val="Listenabsatz"/>
-        <w:numPr>
-          <w:ilvl w:val="0"/>
-          <w:numId w:val="15"/>
-        </w:numPr>
-      </w:pPr>
-      <w:proofErr w:type="spellStart"/>
-      <w:r>
-        <w:t>Red</w:t>
-      </w:r>
-      <w:proofErr w:type="spellEnd"/>
-      <w:r>
-        <w:t xml:space="preserve"> Teaming / </w:t>
-      </w:r>
-      <w:proofErr w:type="spellStart"/>
-      <w:r>
-        <w:t>Adversarial</w:t>
-      </w:r>
-      <w:proofErr w:type="spellEnd"/>
-      <w:r>
-        <w:t xml:space="preserve"> </w:t>
-      </w:r>
-      <w:proofErr w:type="spellStart"/>
-      <w:r>
-        <w:t>Testing</w:t>
-      </w:r>
-      <w:proofErr w:type="spellEnd"/>
-      <w:r>
-        <w:t>: Systematische, simulierte Angriffe (interne Teams oder externe Dienstleister) vor und nach Produktivsetzung.</w:t>
-      </w:r>
-    </w:p>
-    <w:p>
-      <w:pPr>
-        <w:pStyle w:val="Listenabsatz"/>
-        <w:numPr>
-          <w:ilvl w:val="0"/>
-          <w:numId w:val="15"/>
-        </w:numPr>
-      </w:pPr>
-      <w:r>
-        <w:t xml:space="preserve">Bug-Bounty-Programme: Externe Sicherheitsforscher werden incentiviert, </w:t>
+      <w:r>
+        <w:t>Inwieweit ist ein unternehmensinterner, LLM-basierter Chatbot gegenüber Prompt-</w:t>
       </w:r>
       <w:proofErr w:type="spellStart"/>
       <w:r>
@@ -941,73 +859,11 @@
       </w:r>
       <w:proofErr w:type="spellEnd"/>
       <w:r>
-        <w:t>-Schwachstellen zu melden.</w:t>
-      </w:r>
-    </w:p>
-    <w:p>
-      <w:pPr>
-        <w:pStyle w:val="Listenabsatz"/>
-        <w:numPr>
-          <w:ilvl w:val="0"/>
-          <w:numId w:val="15"/>
-        </w:numPr>
-      </w:pPr>
-      <w:r>
-        <w:lastRenderedPageBreak/>
-        <w:t>Security-Review-Prozesse für neue Tools/Integrationen: Jede neue Tool-Anbindung durchläuft eine Risikobewertung (welche Daten, welche Rechte, welcher Schaden im Worst Case).</w:t>
-      </w:r>
-    </w:p>
-    <w:p>
-      <w:pPr>
-        <w:pStyle w:val="Listenabsatz"/>
-        <w:numPr>
-          <w:ilvl w:val="0"/>
-          <w:numId w:val="15"/>
-        </w:numPr>
-      </w:pPr>
-      <w:proofErr w:type="spellStart"/>
-      <w:r>
-        <w:t>Incident</w:t>
-      </w:r>
-      <w:proofErr w:type="spellEnd"/>
-      <w:r>
-        <w:t xml:space="preserve">-Response-Pläne: Definierte Abläufe für den Fall einer erfolgreichen </w:t>
-      </w:r>
-      <w:proofErr w:type="spellStart"/>
-      <w:r>
-        <w:t>Injection</w:t>
-      </w:r>
-      <w:proofErr w:type="spellEnd"/>
-      <w:r>
-        <w:t xml:space="preserve"> (Tool-Zugriffe sperren, betroffene Sitzungen isolieren, Nutzer informieren).</w:t>
-      </w:r>
-    </w:p>
-    <w:p>
-      <w:pPr>
-        <w:pStyle w:val="Listenabsatz"/>
-        <w:numPr>
-          <w:ilvl w:val="0"/>
-          <w:numId w:val="15"/>
-        </w:numPr>
-      </w:pPr>
-      <w:r>
-        <w:t xml:space="preserve">Schulung/Awareness der Entwickler: Sensibilisierung dafür, dass LLM-Ausgaben und Tool-Ergebnisse grundsätzlich wie nicht vertrauenswürdiger externer Input zu behandeln sind (Analogie zu klassischen </w:t>
-      </w:r>
-      <w:proofErr w:type="spellStart"/>
-      <w:r>
-        <w:t>Injection</w:t>
-      </w:r>
-      <w:proofErr w:type="spellEnd"/>
-      <w:r>
-        <w:t xml:space="preserve">-Schwachstellen wie </w:t>
-      </w:r>
-      <w:proofErr w:type="spellStart"/>
-      <w:r>
-        <w:t>SQLi</w:t>
-      </w:r>
-      <w:proofErr w:type="spellEnd"/>
-      <w:r>
-        <w:t>/XSS).</w:t>
+        <w:t xml:space="preserve">-Angriffen verwundbar, und wie </w:t>
+      </w:r>
+      <w:r>
+        <w:br/>
+        <w:t>können rollenbasierte Zugriffskontrollen sowie strukturierte Prompt-Formate zur Absicherung sensibler Daten beitragen?</w:t>
       </w:r>
     </w:p>
     <w:p/>

</xml_diff>